<commit_message>
Correct 450-class shell OD from 461 mm to 460 mm
Prior quotes (BTA-F0515-001 / BTA-F0623-001) were received against
phi-461 and are kept as history with a correction note requiring
re-quotation at phi-460 x 8.

Co-Authored-By: Claude Fable 5 <noreply@anthropic.com>
Claude-Session: https://claude.ai/code/session_01D8V4YsNDSgybhuKSqPBmt4
</commit_message>
<xml_diff>
--- a/docs/shandong-botong/Botong_Document_Request_List.docx
+++ b/docs/shandong-botong/Botong_Document_Request_List.docx
@@ -1035,21 +1035,21 @@
           <w:sz w:val="21"/>
           <w:szCs w:val="21"/>
         </w:rPr>
-        <w:t xml:space="preserve">Are φ450 &amp; φ461 produced in-house or by a partner factory? If by a partner: who issues the MTC, and can Botong still issue the FTA C/O under HS 7608.20?</w:t>
-      </w:r>
-    </w:p>
-    <w:p>
-      <w:pPr>
-        <w:spacing w:after="40"/>
-        <w:ind w:left="720"/>
-      </w:pPr>
-      <w:r>
-        <w:rPr>
-          <w:color w:val="555555"/>
-          <w:sz w:val="20"/>
-          <w:szCs w:val="20"/>
-        </w:rPr>
-        <w:t xml:space="preserve">φ450·φ461 자사 생산 여부. 외주 생산 시 MTC 발행 주체 및 Botong 명의 한-중 FTA C/O(HS 7608.20) 발급 가능 여부?</w:t>
+        <w:t xml:space="preserve">Are φ450 &amp; φ460 produced in-house or by a partner factory? If by a partner: who issues the MTC, and can Botong still issue the FTA C/O under HS 7608.20?</w:t>
+      </w:r>
+    </w:p>
+    <w:p>
+      <w:pPr>
+        <w:spacing w:after="40"/>
+        <w:ind w:left="720"/>
+      </w:pPr>
+      <w:r>
+        <w:rPr>
+          <w:color w:val="555555"/>
+          <w:sz w:val="20"/>
+          <w:szCs w:val="20"/>
+        </w:rPr>
+        <w:t xml:space="preserve">φ450·φ460 자사 생산 여부. 외주 생산 시 MTC 발행 주체 및 Botong 명의 한-중 FTA C/O(HS 7608.20) 발급 가능 여부?</w:t>
       </w:r>
     </w:p>
     <w:p>

</xml_diff>

<commit_message>
Add JSMTEC Group A/B/C item breakdown and Group A/B RFQ
- Dossier: full Group A (7 items, t30) / Group B (11 items, t10) /
  Group C tables with discussion points; Group A/B not yet quoted
- Request list: new RFQ section asking Botong to quote all Group A/B
  items (6061-T6 cold drawn seamless, L2,000mm) with process and
  in-house production disclosure
- Group C C-2 reflected as 460 mm per earlier correction

Co-Authored-By: Claude Fable 5 <noreply@anthropic.com>
Claude-Session: https://claude.ai/code/session_01D8V4YsNDSgybhuKSqPBmt4
</commit_message>
<xml_diff>
--- a/docs/shandong-botong/Botong_Document_Request_List.docx
+++ b/docs/shandong-botong/Botong_Document_Request_List.docx
@@ -1149,6 +1149,2318 @@
           <w:szCs w:val="20"/>
         </w:rPr>
         <w:t xml:space="preserve">공장 방문 가능 여부</w:t>
+      </w:r>
+    </w:p>
+    <w:p>
+      <w:pPr>
+        <w:pStyle w:val="Heading1"/>
+        <w:spacing w:after="60" w:before="300"/>
+      </w:pPr>
+      <w:r>
+        <w:rPr>
+          <w:b/>
+          <w:bCs/>
+          <w:color w:val="2E5878"/>
+          <w:sz w:val="26"/>
+          <w:szCs w:val="26"/>
+        </w:rPr>
+        <w:t xml:space="preserve">6. 신규 견적 요청 — Group A · B</w:t>
+      </w:r>
+    </w:p>
+    <w:p>
+      <w:pPr>
+        <w:spacing w:after="120"/>
+      </w:pPr>
+      <w:r>
+        <w:rPr>
+          <w:i/>
+          <w:iCs/>
+          <w:color w:val="5A9A96"/>
+          <w:sz w:val="20"/>
+          <w:szCs w:val="20"/>
+        </w:rPr>
+        <w:t xml:space="preserve">New RFQ — Group A &amp; B</w:t>
+      </w:r>
+    </w:p>
+    <w:p>
+      <w:pPr>
+        <w:spacing w:after="40"/>
+      </w:pPr>
+      <w:r>
+        <w:rPr>
+          <w:sz w:val="21"/>
+          <w:szCs w:val="21"/>
+        </w:rPr>
+        <w:t xml:space="preserve">In addition to the previously quoted large-diameter items (Group C: 450×30×3000, 460×8×3000 — note the shell OD is corrected to 460 mm, not 461 mm), please quote the following Group A &amp; B items.</w:t>
+      </w:r>
+    </w:p>
+    <w:p>
+      <w:pPr>
+        <w:spacing w:after="80"/>
+      </w:pPr>
+      <w:r>
+        <w:rPr>
+          <w:color w:val="555555"/>
+          <w:sz w:val="20"/>
+          <w:szCs w:val="20"/>
+        </w:rPr>
+        <w:t xml:space="preserve">기존 견적 품목(Group C: 450×30×3000, 460×8×3000 — 외피 외경은 461이 아닌 460mm로 정정)에 더해, 아래 Group A·B 품목의 견적을 요청함.</w:t>
+      </w:r>
+    </w:p>
+    <w:p>
+      <w:pPr>
+        <w:spacing w:after="40"/>
+      </w:pPr>
+      <w:r>
+        <w:rPr>
+          <w:sz w:val="21"/>
+          <w:szCs w:val="21"/>
+        </w:rPr>
+        <w:t xml:space="preserve">All items: 6061-T6, Cold Drawn Seamless, length 2,000 mm. Please state the actual production process (cold drawn / hot extrusion) and whether each size is produced in-house.</w:t>
+      </w:r>
+    </w:p>
+    <w:p>
+      <w:pPr>
+        <w:spacing w:after="120"/>
+      </w:pPr>
+      <w:r>
+        <w:rPr>
+          <w:color w:val="555555"/>
+          <w:sz w:val="20"/>
+          <w:szCs w:val="20"/>
+        </w:rPr>
+        <w:t xml:space="preserve">전 품목 6061-T6, Cold Drawn Seamless, 길이 2,000mm. 품목별 실제 공정(냉간인발/열간압출) 및 자사 생산 여부 명기 요청.</w:t>
+      </w:r>
+    </w:p>
+    <w:p>
+      <w:pPr>
+        <w:spacing w:after="60" w:before="80"/>
+      </w:pPr>
+      <w:r>
+        <w:rPr>
+          <w:b/>
+          <w:bCs/>
+          <w:color w:val="2E5878"/>
+          <w:sz w:val="21"/>
+          <w:szCs w:val="21"/>
+        </w:rPr>
+        <w:t xml:space="preserve">Group A — wall t30 mm (7 items) / 벽두께 t30mm</w:t>
+      </w:r>
+    </w:p>
+    <w:tbl>
+      <w:tblPr>
+        <w:tblW w:type="dxa" w:w="9306"/>
+        <w:tblBorders>
+          <w:top w:val="single" w:color="auto" w:sz="4"/>
+          <w:left w:val="single" w:color="auto" w:sz="4"/>
+          <w:bottom w:val="single" w:color="auto" w:sz="4"/>
+          <w:right w:val="single" w:color="auto" w:sz="4"/>
+          <w:insideH w:val="single" w:color="auto" w:sz="4"/>
+          <w:insideV w:val="single" w:color="auto" w:sz="4"/>
+        </w:tblBorders>
+      </w:tblPr>
+      <w:tblGrid>
+        <w:gridCol w:w="1200"/>
+        <w:gridCol w:w="2700"/>
+        <w:gridCol w:w="2700"/>
+        <w:gridCol w:w="2706"/>
+      </w:tblGrid>
+      <w:tr>
+        <w:tc>
+          <w:tcPr>
+            <w:tcW w:type="dxa" w:w="1200"/>
+            <w:shd w:fill="E4EEF1" w:val="clear"/>
+            <w:tcMar>
+              <w:top w:type="dxa" w:w="50"/>
+              <w:left w:type="dxa" w:w="100"/>
+              <w:bottom w:type="dxa" w:w="50"/>
+              <w:right w:type="dxa" w:w="100"/>
+            </w:tcMar>
+            <w:vAlign w:val="center"/>
+          </w:tcPr>
+          <w:p>
+            <w:pPr>
+              <w:spacing w:after="0"/>
+            </w:pPr>
+            <w:r>
+              <w:rPr>
+                <w:b/>
+                <w:bCs/>
+                <w:color w:val="2E5878"/>
+                <w:sz w:val="19"/>
+                <w:szCs w:val="19"/>
+              </w:rPr>
+              <w:t xml:space="preserve">No.</w:t>
+            </w:r>
+          </w:p>
+        </w:tc>
+        <w:tc>
+          <w:tcPr>
+            <w:tcW w:type="dxa" w:w="2700"/>
+            <w:shd w:fill="E4EEF1" w:val="clear"/>
+            <w:tcMar>
+              <w:top w:type="dxa" w:w="50"/>
+              <w:left w:type="dxa" w:w="100"/>
+              <w:bottom w:type="dxa" w:w="50"/>
+              <w:right w:type="dxa" w:w="100"/>
+            </w:tcMar>
+            <w:vAlign w:val="center"/>
+          </w:tcPr>
+          <w:p>
+            <w:pPr>
+              <w:spacing w:after="0"/>
+            </w:pPr>
+            <w:r>
+              <w:rPr>
+                <w:b/>
+                <w:bCs/>
+                <w:color w:val="2E5878"/>
+                <w:sz w:val="19"/>
+                <w:szCs w:val="19"/>
+              </w:rPr>
+              <w:t xml:space="preserve">OD (mm)</w:t>
+            </w:r>
+          </w:p>
+        </w:tc>
+        <w:tc>
+          <w:tcPr>
+            <w:tcW w:type="dxa" w:w="2700"/>
+            <w:shd w:fill="E4EEF1" w:val="clear"/>
+            <w:tcMar>
+              <w:top w:type="dxa" w:w="50"/>
+              <w:left w:type="dxa" w:w="100"/>
+              <w:bottom w:type="dxa" w:w="50"/>
+              <w:right w:type="dxa" w:w="100"/>
+            </w:tcMar>
+            <w:vAlign w:val="center"/>
+          </w:tcPr>
+          <w:p>
+            <w:pPr>
+              <w:spacing w:after="0"/>
+            </w:pPr>
+            <w:r>
+              <w:rPr>
+                <w:b/>
+                <w:bCs/>
+                <w:color w:val="2E5878"/>
+                <w:sz w:val="19"/>
+                <w:szCs w:val="19"/>
+              </w:rPr>
+              <w:t xml:space="preserve">t (mm)</w:t>
+            </w:r>
+          </w:p>
+        </w:tc>
+        <w:tc>
+          <w:tcPr>
+            <w:tcW w:type="dxa" w:w="2706"/>
+            <w:shd w:fill="E4EEF1" w:val="clear"/>
+            <w:tcMar>
+              <w:top w:type="dxa" w:w="50"/>
+              <w:left w:type="dxa" w:w="100"/>
+              <w:bottom w:type="dxa" w:w="50"/>
+              <w:right w:type="dxa" w:w="100"/>
+            </w:tcMar>
+            <w:vAlign w:val="center"/>
+          </w:tcPr>
+          <w:p>
+            <w:pPr>
+              <w:spacing w:after="0"/>
+            </w:pPr>
+            <w:r>
+              <w:rPr>
+                <w:b/>
+                <w:bCs/>
+                <w:color w:val="2E5878"/>
+                <w:sz w:val="19"/>
+                <w:szCs w:val="19"/>
+              </w:rPr>
+              <w:t xml:space="preserve">L (mm)</w:t>
+            </w:r>
+          </w:p>
+        </w:tc>
+      </w:tr>
+      <w:tr>
+        <w:tc>
+          <w:tcPr>
+            <w:tcW w:type="dxa" w:w="1200"/>
+            <w:tcMar>
+              <w:top w:type="dxa" w:w="50"/>
+              <w:left w:type="dxa" w:w="100"/>
+              <w:bottom w:type="dxa" w:w="50"/>
+              <w:right w:type="dxa" w:w="100"/>
+            </w:tcMar>
+            <w:vAlign w:val="center"/>
+          </w:tcPr>
+          <w:p>
+            <w:pPr>
+              <w:spacing w:after="0"/>
+            </w:pPr>
+            <w:r>
+              <w:rPr>
+                <w:b w:val="false"/>
+                <w:bCs w:val="false"/>
+                <w:sz w:val="19"/>
+                <w:szCs w:val="19"/>
+              </w:rPr>
+              <w:t xml:space="preserve">A-1</w:t>
+            </w:r>
+          </w:p>
+        </w:tc>
+        <w:tc>
+          <w:tcPr>
+            <w:tcW w:type="dxa" w:w="2700"/>
+            <w:tcMar>
+              <w:top w:type="dxa" w:w="50"/>
+              <w:left w:type="dxa" w:w="100"/>
+              <w:bottom w:type="dxa" w:w="50"/>
+              <w:right w:type="dxa" w:w="100"/>
+            </w:tcMar>
+            <w:vAlign w:val="center"/>
+          </w:tcPr>
+          <w:p>
+            <w:pPr>
+              <w:spacing w:after="0"/>
+            </w:pPr>
+            <w:r>
+              <w:rPr>
+                <w:b w:val="false"/>
+                <w:bCs w:val="false"/>
+                <w:sz w:val="19"/>
+                <w:szCs w:val="19"/>
+              </w:rPr>
+              <w:t xml:space="preserve">120</w:t>
+            </w:r>
+          </w:p>
+        </w:tc>
+        <w:tc>
+          <w:tcPr>
+            <w:tcW w:type="dxa" w:w="2700"/>
+            <w:tcMar>
+              <w:top w:type="dxa" w:w="50"/>
+              <w:left w:type="dxa" w:w="100"/>
+              <w:bottom w:type="dxa" w:w="50"/>
+              <w:right w:type="dxa" w:w="100"/>
+            </w:tcMar>
+            <w:vAlign w:val="center"/>
+          </w:tcPr>
+          <w:p>
+            <w:pPr>
+              <w:spacing w:after="0"/>
+            </w:pPr>
+            <w:r>
+              <w:rPr>
+                <w:b w:val="false"/>
+                <w:bCs w:val="false"/>
+                <w:sz w:val="19"/>
+                <w:szCs w:val="19"/>
+              </w:rPr>
+              <w:t xml:space="preserve">30</w:t>
+            </w:r>
+          </w:p>
+        </w:tc>
+        <w:tc>
+          <w:tcPr>
+            <w:tcW w:type="dxa" w:w="2706"/>
+            <w:tcMar>
+              <w:top w:type="dxa" w:w="50"/>
+              <w:left w:type="dxa" w:w="100"/>
+              <w:bottom w:type="dxa" w:w="50"/>
+              <w:right w:type="dxa" w:w="100"/>
+            </w:tcMar>
+            <w:vAlign w:val="center"/>
+          </w:tcPr>
+          <w:p>
+            <w:pPr>
+              <w:spacing w:after="0"/>
+            </w:pPr>
+            <w:r>
+              <w:rPr>
+                <w:b w:val="false"/>
+                <w:bCs w:val="false"/>
+                <w:sz w:val="19"/>
+                <w:szCs w:val="19"/>
+              </w:rPr>
+              <w:t xml:space="preserve">2,000</w:t>
+            </w:r>
+          </w:p>
+        </w:tc>
+      </w:tr>
+      <w:tr>
+        <w:tc>
+          <w:tcPr>
+            <w:tcW w:type="dxa" w:w="1200"/>
+            <w:tcMar>
+              <w:top w:type="dxa" w:w="50"/>
+              <w:left w:type="dxa" w:w="100"/>
+              <w:bottom w:type="dxa" w:w="50"/>
+              <w:right w:type="dxa" w:w="100"/>
+            </w:tcMar>
+            <w:vAlign w:val="center"/>
+          </w:tcPr>
+          <w:p>
+            <w:pPr>
+              <w:spacing w:after="0"/>
+            </w:pPr>
+            <w:r>
+              <w:rPr>
+                <w:b w:val="false"/>
+                <w:bCs w:val="false"/>
+                <w:sz w:val="19"/>
+                <w:szCs w:val="19"/>
+              </w:rPr>
+              <w:t xml:space="preserve">A-2</w:t>
+            </w:r>
+          </w:p>
+        </w:tc>
+        <w:tc>
+          <w:tcPr>
+            <w:tcW w:type="dxa" w:w="2700"/>
+            <w:tcMar>
+              <w:top w:type="dxa" w:w="50"/>
+              <w:left w:type="dxa" w:w="100"/>
+              <w:bottom w:type="dxa" w:w="50"/>
+              <w:right w:type="dxa" w:w="100"/>
+            </w:tcMar>
+            <w:vAlign w:val="center"/>
+          </w:tcPr>
+          <w:p>
+            <w:pPr>
+              <w:spacing w:after="0"/>
+            </w:pPr>
+            <w:r>
+              <w:rPr>
+                <w:b w:val="false"/>
+                <w:bCs w:val="false"/>
+                <w:sz w:val="19"/>
+                <w:szCs w:val="19"/>
+              </w:rPr>
+              <w:t xml:space="preserve">150</w:t>
+            </w:r>
+          </w:p>
+        </w:tc>
+        <w:tc>
+          <w:tcPr>
+            <w:tcW w:type="dxa" w:w="2700"/>
+            <w:tcMar>
+              <w:top w:type="dxa" w:w="50"/>
+              <w:left w:type="dxa" w:w="100"/>
+              <w:bottom w:type="dxa" w:w="50"/>
+              <w:right w:type="dxa" w:w="100"/>
+            </w:tcMar>
+            <w:vAlign w:val="center"/>
+          </w:tcPr>
+          <w:p>
+            <w:pPr>
+              <w:spacing w:after="0"/>
+            </w:pPr>
+            <w:r>
+              <w:rPr>
+                <w:b w:val="false"/>
+                <w:bCs w:val="false"/>
+                <w:sz w:val="19"/>
+                <w:szCs w:val="19"/>
+              </w:rPr>
+              <w:t xml:space="preserve">30</w:t>
+            </w:r>
+          </w:p>
+        </w:tc>
+        <w:tc>
+          <w:tcPr>
+            <w:tcW w:type="dxa" w:w="2706"/>
+            <w:tcMar>
+              <w:top w:type="dxa" w:w="50"/>
+              <w:left w:type="dxa" w:w="100"/>
+              <w:bottom w:type="dxa" w:w="50"/>
+              <w:right w:type="dxa" w:w="100"/>
+            </w:tcMar>
+            <w:vAlign w:val="center"/>
+          </w:tcPr>
+          <w:p>
+            <w:pPr>
+              <w:spacing w:after="0"/>
+            </w:pPr>
+            <w:r>
+              <w:rPr>
+                <w:b w:val="false"/>
+                <w:bCs w:val="false"/>
+                <w:sz w:val="19"/>
+                <w:szCs w:val="19"/>
+              </w:rPr>
+              <w:t xml:space="preserve">2,000</w:t>
+            </w:r>
+          </w:p>
+        </w:tc>
+      </w:tr>
+      <w:tr>
+        <w:tc>
+          <w:tcPr>
+            <w:tcW w:type="dxa" w:w="1200"/>
+            <w:tcMar>
+              <w:top w:type="dxa" w:w="50"/>
+              <w:left w:type="dxa" w:w="100"/>
+              <w:bottom w:type="dxa" w:w="50"/>
+              <w:right w:type="dxa" w:w="100"/>
+            </w:tcMar>
+            <w:vAlign w:val="center"/>
+          </w:tcPr>
+          <w:p>
+            <w:pPr>
+              <w:spacing w:after="0"/>
+            </w:pPr>
+            <w:r>
+              <w:rPr>
+                <w:b w:val="false"/>
+                <w:bCs w:val="false"/>
+                <w:sz w:val="19"/>
+                <w:szCs w:val="19"/>
+              </w:rPr>
+              <w:t xml:space="preserve">A-3</w:t>
+            </w:r>
+          </w:p>
+        </w:tc>
+        <w:tc>
+          <w:tcPr>
+            <w:tcW w:type="dxa" w:w="2700"/>
+            <w:tcMar>
+              <w:top w:type="dxa" w:w="50"/>
+              <w:left w:type="dxa" w:w="100"/>
+              <w:bottom w:type="dxa" w:w="50"/>
+              <w:right w:type="dxa" w:w="100"/>
+            </w:tcMar>
+            <w:vAlign w:val="center"/>
+          </w:tcPr>
+          <w:p>
+            <w:pPr>
+              <w:spacing w:after="0"/>
+            </w:pPr>
+            <w:r>
+              <w:rPr>
+                <w:b w:val="false"/>
+                <w:bCs w:val="false"/>
+                <w:sz w:val="19"/>
+                <w:szCs w:val="19"/>
+              </w:rPr>
+              <w:t xml:space="preserve">160</w:t>
+            </w:r>
+          </w:p>
+        </w:tc>
+        <w:tc>
+          <w:tcPr>
+            <w:tcW w:type="dxa" w:w="2700"/>
+            <w:tcMar>
+              <w:top w:type="dxa" w:w="50"/>
+              <w:left w:type="dxa" w:w="100"/>
+              <w:bottom w:type="dxa" w:w="50"/>
+              <w:right w:type="dxa" w:w="100"/>
+            </w:tcMar>
+            <w:vAlign w:val="center"/>
+          </w:tcPr>
+          <w:p>
+            <w:pPr>
+              <w:spacing w:after="0"/>
+            </w:pPr>
+            <w:r>
+              <w:rPr>
+                <w:b w:val="false"/>
+                <w:bCs w:val="false"/>
+                <w:sz w:val="19"/>
+                <w:szCs w:val="19"/>
+              </w:rPr>
+              <w:t xml:space="preserve">30</w:t>
+            </w:r>
+          </w:p>
+        </w:tc>
+        <w:tc>
+          <w:tcPr>
+            <w:tcW w:type="dxa" w:w="2706"/>
+            <w:tcMar>
+              <w:top w:type="dxa" w:w="50"/>
+              <w:left w:type="dxa" w:w="100"/>
+              <w:bottom w:type="dxa" w:w="50"/>
+              <w:right w:type="dxa" w:w="100"/>
+            </w:tcMar>
+            <w:vAlign w:val="center"/>
+          </w:tcPr>
+          <w:p>
+            <w:pPr>
+              <w:spacing w:after="0"/>
+            </w:pPr>
+            <w:r>
+              <w:rPr>
+                <w:b w:val="false"/>
+                <w:bCs w:val="false"/>
+                <w:sz w:val="19"/>
+                <w:szCs w:val="19"/>
+              </w:rPr>
+              <w:t xml:space="preserve">2,000</w:t>
+            </w:r>
+          </w:p>
+        </w:tc>
+      </w:tr>
+      <w:tr>
+        <w:tc>
+          <w:tcPr>
+            <w:tcW w:type="dxa" w:w="1200"/>
+            <w:tcMar>
+              <w:top w:type="dxa" w:w="50"/>
+              <w:left w:type="dxa" w:w="100"/>
+              <w:bottom w:type="dxa" w:w="50"/>
+              <w:right w:type="dxa" w:w="100"/>
+            </w:tcMar>
+            <w:vAlign w:val="center"/>
+          </w:tcPr>
+          <w:p>
+            <w:pPr>
+              <w:spacing w:after="0"/>
+            </w:pPr>
+            <w:r>
+              <w:rPr>
+                <w:b w:val="false"/>
+                <w:bCs w:val="false"/>
+                <w:sz w:val="19"/>
+                <w:szCs w:val="19"/>
+              </w:rPr>
+              <w:t xml:space="preserve">A-4</w:t>
+            </w:r>
+          </w:p>
+        </w:tc>
+        <w:tc>
+          <w:tcPr>
+            <w:tcW w:type="dxa" w:w="2700"/>
+            <w:tcMar>
+              <w:top w:type="dxa" w:w="50"/>
+              <w:left w:type="dxa" w:w="100"/>
+              <w:bottom w:type="dxa" w:w="50"/>
+              <w:right w:type="dxa" w:w="100"/>
+            </w:tcMar>
+            <w:vAlign w:val="center"/>
+          </w:tcPr>
+          <w:p>
+            <w:pPr>
+              <w:spacing w:after="0"/>
+            </w:pPr>
+            <w:r>
+              <w:rPr>
+                <w:b w:val="false"/>
+                <w:bCs w:val="false"/>
+                <w:sz w:val="19"/>
+                <w:szCs w:val="19"/>
+              </w:rPr>
+              <w:t xml:space="preserve">180</w:t>
+            </w:r>
+          </w:p>
+        </w:tc>
+        <w:tc>
+          <w:tcPr>
+            <w:tcW w:type="dxa" w:w="2700"/>
+            <w:tcMar>
+              <w:top w:type="dxa" w:w="50"/>
+              <w:left w:type="dxa" w:w="100"/>
+              <w:bottom w:type="dxa" w:w="50"/>
+              <w:right w:type="dxa" w:w="100"/>
+            </w:tcMar>
+            <w:vAlign w:val="center"/>
+          </w:tcPr>
+          <w:p>
+            <w:pPr>
+              <w:spacing w:after="0"/>
+            </w:pPr>
+            <w:r>
+              <w:rPr>
+                <w:b w:val="false"/>
+                <w:bCs w:val="false"/>
+                <w:sz w:val="19"/>
+                <w:szCs w:val="19"/>
+              </w:rPr>
+              <w:t xml:space="preserve">30</w:t>
+            </w:r>
+          </w:p>
+        </w:tc>
+        <w:tc>
+          <w:tcPr>
+            <w:tcW w:type="dxa" w:w="2706"/>
+            <w:tcMar>
+              <w:top w:type="dxa" w:w="50"/>
+              <w:left w:type="dxa" w:w="100"/>
+              <w:bottom w:type="dxa" w:w="50"/>
+              <w:right w:type="dxa" w:w="100"/>
+            </w:tcMar>
+            <w:vAlign w:val="center"/>
+          </w:tcPr>
+          <w:p>
+            <w:pPr>
+              <w:spacing w:after="0"/>
+            </w:pPr>
+            <w:r>
+              <w:rPr>
+                <w:b w:val="false"/>
+                <w:bCs w:val="false"/>
+                <w:sz w:val="19"/>
+                <w:szCs w:val="19"/>
+              </w:rPr>
+              <w:t xml:space="preserve">2,000</w:t>
+            </w:r>
+          </w:p>
+        </w:tc>
+      </w:tr>
+      <w:tr>
+        <w:tc>
+          <w:tcPr>
+            <w:tcW w:type="dxa" w:w="1200"/>
+            <w:tcMar>
+              <w:top w:type="dxa" w:w="50"/>
+              <w:left w:type="dxa" w:w="100"/>
+              <w:bottom w:type="dxa" w:w="50"/>
+              <w:right w:type="dxa" w:w="100"/>
+            </w:tcMar>
+            <w:vAlign w:val="center"/>
+          </w:tcPr>
+          <w:p>
+            <w:pPr>
+              <w:spacing w:after="0"/>
+            </w:pPr>
+            <w:r>
+              <w:rPr>
+                <w:b w:val="false"/>
+                <w:bCs w:val="false"/>
+                <w:sz w:val="19"/>
+                <w:szCs w:val="19"/>
+              </w:rPr>
+              <w:t xml:space="preserve">A-5</w:t>
+            </w:r>
+          </w:p>
+        </w:tc>
+        <w:tc>
+          <w:tcPr>
+            <w:tcW w:type="dxa" w:w="2700"/>
+            <w:tcMar>
+              <w:top w:type="dxa" w:w="50"/>
+              <w:left w:type="dxa" w:w="100"/>
+              <w:bottom w:type="dxa" w:w="50"/>
+              <w:right w:type="dxa" w:w="100"/>
+            </w:tcMar>
+            <w:vAlign w:val="center"/>
+          </w:tcPr>
+          <w:p>
+            <w:pPr>
+              <w:spacing w:after="0"/>
+            </w:pPr>
+            <w:r>
+              <w:rPr>
+                <w:b w:val="false"/>
+                <w:bCs w:val="false"/>
+                <w:sz w:val="19"/>
+                <w:szCs w:val="19"/>
+              </w:rPr>
+              <w:t xml:space="preserve">200</w:t>
+            </w:r>
+          </w:p>
+        </w:tc>
+        <w:tc>
+          <w:tcPr>
+            <w:tcW w:type="dxa" w:w="2700"/>
+            <w:tcMar>
+              <w:top w:type="dxa" w:w="50"/>
+              <w:left w:type="dxa" w:w="100"/>
+              <w:bottom w:type="dxa" w:w="50"/>
+              <w:right w:type="dxa" w:w="100"/>
+            </w:tcMar>
+            <w:vAlign w:val="center"/>
+          </w:tcPr>
+          <w:p>
+            <w:pPr>
+              <w:spacing w:after="0"/>
+            </w:pPr>
+            <w:r>
+              <w:rPr>
+                <w:b w:val="false"/>
+                <w:bCs w:val="false"/>
+                <w:sz w:val="19"/>
+                <w:szCs w:val="19"/>
+              </w:rPr>
+              <w:t xml:space="preserve">30</w:t>
+            </w:r>
+          </w:p>
+        </w:tc>
+        <w:tc>
+          <w:tcPr>
+            <w:tcW w:type="dxa" w:w="2706"/>
+            <w:tcMar>
+              <w:top w:type="dxa" w:w="50"/>
+              <w:left w:type="dxa" w:w="100"/>
+              <w:bottom w:type="dxa" w:w="50"/>
+              <w:right w:type="dxa" w:w="100"/>
+            </w:tcMar>
+            <w:vAlign w:val="center"/>
+          </w:tcPr>
+          <w:p>
+            <w:pPr>
+              <w:spacing w:after="0"/>
+            </w:pPr>
+            <w:r>
+              <w:rPr>
+                <w:b w:val="false"/>
+                <w:bCs w:val="false"/>
+                <w:sz w:val="19"/>
+                <w:szCs w:val="19"/>
+              </w:rPr>
+              <w:t xml:space="preserve">2,000</w:t>
+            </w:r>
+          </w:p>
+        </w:tc>
+      </w:tr>
+      <w:tr>
+        <w:tc>
+          <w:tcPr>
+            <w:tcW w:type="dxa" w:w="1200"/>
+            <w:tcMar>
+              <w:top w:type="dxa" w:w="50"/>
+              <w:left w:type="dxa" w:w="100"/>
+              <w:bottom w:type="dxa" w:w="50"/>
+              <w:right w:type="dxa" w:w="100"/>
+            </w:tcMar>
+            <w:vAlign w:val="center"/>
+          </w:tcPr>
+          <w:p>
+            <w:pPr>
+              <w:spacing w:after="0"/>
+            </w:pPr>
+            <w:r>
+              <w:rPr>
+                <w:b w:val="false"/>
+                <w:bCs w:val="false"/>
+                <w:sz w:val="19"/>
+                <w:szCs w:val="19"/>
+              </w:rPr>
+              <w:t xml:space="preserve">A-6</w:t>
+            </w:r>
+          </w:p>
+        </w:tc>
+        <w:tc>
+          <w:tcPr>
+            <w:tcW w:type="dxa" w:w="2700"/>
+            <w:tcMar>
+              <w:top w:type="dxa" w:w="50"/>
+              <w:left w:type="dxa" w:w="100"/>
+              <w:bottom w:type="dxa" w:w="50"/>
+              <w:right w:type="dxa" w:w="100"/>
+            </w:tcMar>
+            <w:vAlign w:val="center"/>
+          </w:tcPr>
+          <w:p>
+            <w:pPr>
+              <w:spacing w:after="0"/>
+            </w:pPr>
+            <w:r>
+              <w:rPr>
+                <w:b w:val="false"/>
+                <w:bCs w:val="false"/>
+                <w:sz w:val="19"/>
+                <w:szCs w:val="19"/>
+              </w:rPr>
+              <w:t xml:space="preserve">250</w:t>
+            </w:r>
+          </w:p>
+        </w:tc>
+        <w:tc>
+          <w:tcPr>
+            <w:tcW w:type="dxa" w:w="2700"/>
+            <w:tcMar>
+              <w:top w:type="dxa" w:w="50"/>
+              <w:left w:type="dxa" w:w="100"/>
+              <w:bottom w:type="dxa" w:w="50"/>
+              <w:right w:type="dxa" w:w="100"/>
+            </w:tcMar>
+            <w:vAlign w:val="center"/>
+          </w:tcPr>
+          <w:p>
+            <w:pPr>
+              <w:spacing w:after="0"/>
+            </w:pPr>
+            <w:r>
+              <w:rPr>
+                <w:b w:val="false"/>
+                <w:bCs w:val="false"/>
+                <w:sz w:val="19"/>
+                <w:szCs w:val="19"/>
+              </w:rPr>
+              <w:t xml:space="preserve">30</w:t>
+            </w:r>
+          </w:p>
+        </w:tc>
+        <w:tc>
+          <w:tcPr>
+            <w:tcW w:type="dxa" w:w="2706"/>
+            <w:tcMar>
+              <w:top w:type="dxa" w:w="50"/>
+              <w:left w:type="dxa" w:w="100"/>
+              <w:bottom w:type="dxa" w:w="50"/>
+              <w:right w:type="dxa" w:w="100"/>
+            </w:tcMar>
+            <w:vAlign w:val="center"/>
+          </w:tcPr>
+          <w:p>
+            <w:pPr>
+              <w:spacing w:after="0"/>
+            </w:pPr>
+            <w:r>
+              <w:rPr>
+                <w:b w:val="false"/>
+                <w:bCs w:val="false"/>
+                <w:sz w:val="19"/>
+                <w:szCs w:val="19"/>
+              </w:rPr>
+              <w:t xml:space="preserve">2,000</w:t>
+            </w:r>
+          </w:p>
+        </w:tc>
+      </w:tr>
+      <w:tr>
+        <w:tc>
+          <w:tcPr>
+            <w:tcW w:type="dxa" w:w="1200"/>
+            <w:tcMar>
+              <w:top w:type="dxa" w:w="50"/>
+              <w:left w:type="dxa" w:w="100"/>
+              <w:bottom w:type="dxa" w:w="50"/>
+              <w:right w:type="dxa" w:w="100"/>
+            </w:tcMar>
+            <w:vAlign w:val="center"/>
+          </w:tcPr>
+          <w:p>
+            <w:pPr>
+              <w:spacing w:after="0"/>
+            </w:pPr>
+            <w:r>
+              <w:rPr>
+                <w:b w:val="false"/>
+                <w:bCs w:val="false"/>
+                <w:sz w:val="19"/>
+                <w:szCs w:val="19"/>
+              </w:rPr>
+              <w:t xml:space="preserve">A-7</w:t>
+            </w:r>
+          </w:p>
+        </w:tc>
+        <w:tc>
+          <w:tcPr>
+            <w:tcW w:type="dxa" w:w="2700"/>
+            <w:tcMar>
+              <w:top w:type="dxa" w:w="50"/>
+              <w:left w:type="dxa" w:w="100"/>
+              <w:bottom w:type="dxa" w:w="50"/>
+              <w:right w:type="dxa" w:w="100"/>
+            </w:tcMar>
+            <w:vAlign w:val="center"/>
+          </w:tcPr>
+          <w:p>
+            <w:pPr>
+              <w:spacing w:after="0"/>
+            </w:pPr>
+            <w:r>
+              <w:rPr>
+                <w:b w:val="false"/>
+                <w:bCs w:val="false"/>
+                <w:sz w:val="19"/>
+                <w:szCs w:val="19"/>
+              </w:rPr>
+              <w:t xml:space="preserve">260</w:t>
+            </w:r>
+          </w:p>
+        </w:tc>
+        <w:tc>
+          <w:tcPr>
+            <w:tcW w:type="dxa" w:w="2700"/>
+            <w:tcMar>
+              <w:top w:type="dxa" w:w="50"/>
+              <w:left w:type="dxa" w:w="100"/>
+              <w:bottom w:type="dxa" w:w="50"/>
+              <w:right w:type="dxa" w:w="100"/>
+            </w:tcMar>
+            <w:vAlign w:val="center"/>
+          </w:tcPr>
+          <w:p>
+            <w:pPr>
+              <w:spacing w:after="0"/>
+            </w:pPr>
+            <w:r>
+              <w:rPr>
+                <w:b w:val="false"/>
+                <w:bCs w:val="false"/>
+                <w:sz w:val="19"/>
+                <w:szCs w:val="19"/>
+              </w:rPr>
+              <w:t xml:space="preserve">30</w:t>
+            </w:r>
+          </w:p>
+        </w:tc>
+        <w:tc>
+          <w:tcPr>
+            <w:tcW w:type="dxa" w:w="2706"/>
+            <w:tcMar>
+              <w:top w:type="dxa" w:w="50"/>
+              <w:left w:type="dxa" w:w="100"/>
+              <w:bottom w:type="dxa" w:w="50"/>
+              <w:right w:type="dxa" w:w="100"/>
+            </w:tcMar>
+            <w:vAlign w:val="center"/>
+          </w:tcPr>
+          <w:p>
+            <w:pPr>
+              <w:spacing w:after="0"/>
+            </w:pPr>
+            <w:r>
+              <w:rPr>
+                <w:b w:val="false"/>
+                <w:bCs w:val="false"/>
+                <w:sz w:val="19"/>
+                <w:szCs w:val="19"/>
+              </w:rPr>
+              <w:t xml:space="preserve">2,000</w:t>
+            </w:r>
+          </w:p>
+        </w:tc>
+      </w:tr>
+    </w:tbl>
+    <w:p>
+      <w:pPr>
+        <w:spacing w:after="60" w:before="160"/>
+      </w:pPr>
+      <w:r>
+        <w:rPr>
+          <w:b/>
+          <w:bCs/>
+          <w:color w:val="2E5878"/>
+          <w:sz w:val="21"/>
+          <w:szCs w:val="21"/>
+        </w:rPr>
+        <w:t xml:space="preserve">Group B — wall t10 mm (11 items) / 벽두께 t10mm</w:t>
+      </w:r>
+    </w:p>
+    <w:tbl>
+      <w:tblPr>
+        <w:tblW w:type="dxa" w:w="9306"/>
+        <w:tblBorders>
+          <w:top w:val="single" w:color="auto" w:sz="4"/>
+          <w:left w:val="single" w:color="auto" w:sz="4"/>
+          <w:bottom w:val="single" w:color="auto" w:sz="4"/>
+          <w:right w:val="single" w:color="auto" w:sz="4"/>
+          <w:insideH w:val="single" w:color="auto" w:sz="4"/>
+          <w:insideV w:val="single" w:color="auto" w:sz="4"/>
+        </w:tblBorders>
+      </w:tblPr>
+      <w:tblGrid>
+        <w:gridCol w:w="1200"/>
+        <w:gridCol w:w="2700"/>
+        <w:gridCol w:w="2700"/>
+        <w:gridCol w:w="2706"/>
+      </w:tblGrid>
+      <w:tr>
+        <w:tc>
+          <w:tcPr>
+            <w:tcW w:type="dxa" w:w="1200"/>
+            <w:shd w:fill="E4EEF1" w:val="clear"/>
+            <w:tcMar>
+              <w:top w:type="dxa" w:w="50"/>
+              <w:left w:type="dxa" w:w="100"/>
+              <w:bottom w:type="dxa" w:w="50"/>
+              <w:right w:type="dxa" w:w="100"/>
+            </w:tcMar>
+            <w:vAlign w:val="center"/>
+          </w:tcPr>
+          <w:p>
+            <w:pPr>
+              <w:spacing w:after="0"/>
+            </w:pPr>
+            <w:r>
+              <w:rPr>
+                <w:b/>
+                <w:bCs/>
+                <w:color w:val="2E5878"/>
+                <w:sz w:val="19"/>
+                <w:szCs w:val="19"/>
+              </w:rPr>
+              <w:t xml:space="preserve">No.</w:t>
+            </w:r>
+          </w:p>
+        </w:tc>
+        <w:tc>
+          <w:tcPr>
+            <w:tcW w:type="dxa" w:w="2700"/>
+            <w:shd w:fill="E4EEF1" w:val="clear"/>
+            <w:tcMar>
+              <w:top w:type="dxa" w:w="50"/>
+              <w:left w:type="dxa" w:w="100"/>
+              <w:bottom w:type="dxa" w:w="50"/>
+              <w:right w:type="dxa" w:w="100"/>
+            </w:tcMar>
+            <w:vAlign w:val="center"/>
+          </w:tcPr>
+          <w:p>
+            <w:pPr>
+              <w:spacing w:after="0"/>
+            </w:pPr>
+            <w:r>
+              <w:rPr>
+                <w:b/>
+                <w:bCs/>
+                <w:color w:val="2E5878"/>
+                <w:sz w:val="19"/>
+                <w:szCs w:val="19"/>
+              </w:rPr>
+              <w:t xml:space="preserve">OD (mm)</w:t>
+            </w:r>
+          </w:p>
+        </w:tc>
+        <w:tc>
+          <w:tcPr>
+            <w:tcW w:type="dxa" w:w="2700"/>
+            <w:shd w:fill="E4EEF1" w:val="clear"/>
+            <w:tcMar>
+              <w:top w:type="dxa" w:w="50"/>
+              <w:left w:type="dxa" w:w="100"/>
+              <w:bottom w:type="dxa" w:w="50"/>
+              <w:right w:type="dxa" w:w="100"/>
+            </w:tcMar>
+            <w:vAlign w:val="center"/>
+          </w:tcPr>
+          <w:p>
+            <w:pPr>
+              <w:spacing w:after="0"/>
+            </w:pPr>
+            <w:r>
+              <w:rPr>
+                <w:b/>
+                <w:bCs/>
+                <w:color w:val="2E5878"/>
+                <w:sz w:val="19"/>
+                <w:szCs w:val="19"/>
+              </w:rPr>
+              <w:t xml:space="preserve">t (mm)</w:t>
+            </w:r>
+          </w:p>
+        </w:tc>
+        <w:tc>
+          <w:tcPr>
+            <w:tcW w:type="dxa" w:w="2706"/>
+            <w:shd w:fill="E4EEF1" w:val="clear"/>
+            <w:tcMar>
+              <w:top w:type="dxa" w:w="50"/>
+              <w:left w:type="dxa" w:w="100"/>
+              <w:bottom w:type="dxa" w:w="50"/>
+              <w:right w:type="dxa" w:w="100"/>
+            </w:tcMar>
+            <w:vAlign w:val="center"/>
+          </w:tcPr>
+          <w:p>
+            <w:pPr>
+              <w:spacing w:after="0"/>
+            </w:pPr>
+            <w:r>
+              <w:rPr>
+                <w:b/>
+                <w:bCs/>
+                <w:color w:val="2E5878"/>
+                <w:sz w:val="19"/>
+                <w:szCs w:val="19"/>
+              </w:rPr>
+              <w:t xml:space="preserve">L (mm)</w:t>
+            </w:r>
+          </w:p>
+        </w:tc>
+      </w:tr>
+      <w:tr>
+        <w:tc>
+          <w:tcPr>
+            <w:tcW w:type="dxa" w:w="1200"/>
+            <w:tcMar>
+              <w:top w:type="dxa" w:w="50"/>
+              <w:left w:type="dxa" w:w="100"/>
+              <w:bottom w:type="dxa" w:w="50"/>
+              <w:right w:type="dxa" w:w="100"/>
+            </w:tcMar>
+            <w:vAlign w:val="center"/>
+          </w:tcPr>
+          <w:p>
+            <w:pPr>
+              <w:spacing w:after="0"/>
+            </w:pPr>
+            <w:r>
+              <w:rPr>
+                <w:b w:val="false"/>
+                <w:bCs w:val="false"/>
+                <w:sz w:val="19"/>
+                <w:szCs w:val="19"/>
+              </w:rPr>
+              <w:t xml:space="preserve">B-1</w:t>
+            </w:r>
+          </w:p>
+        </w:tc>
+        <w:tc>
+          <w:tcPr>
+            <w:tcW w:type="dxa" w:w="2700"/>
+            <w:tcMar>
+              <w:top w:type="dxa" w:w="50"/>
+              <w:left w:type="dxa" w:w="100"/>
+              <w:bottom w:type="dxa" w:w="50"/>
+              <w:right w:type="dxa" w:w="100"/>
+            </w:tcMar>
+            <w:vAlign w:val="center"/>
+          </w:tcPr>
+          <w:p>
+            <w:pPr>
+              <w:spacing w:after="0"/>
+            </w:pPr>
+            <w:r>
+              <w:rPr>
+                <w:b w:val="false"/>
+                <w:bCs w:val="false"/>
+                <w:sz w:val="19"/>
+                <w:szCs w:val="19"/>
+              </w:rPr>
+              <w:t xml:space="preserve">125</w:t>
+            </w:r>
+          </w:p>
+        </w:tc>
+        <w:tc>
+          <w:tcPr>
+            <w:tcW w:type="dxa" w:w="2700"/>
+            <w:tcMar>
+              <w:top w:type="dxa" w:w="50"/>
+              <w:left w:type="dxa" w:w="100"/>
+              <w:bottom w:type="dxa" w:w="50"/>
+              <w:right w:type="dxa" w:w="100"/>
+            </w:tcMar>
+            <w:vAlign w:val="center"/>
+          </w:tcPr>
+          <w:p>
+            <w:pPr>
+              <w:spacing w:after="0"/>
+            </w:pPr>
+            <w:r>
+              <w:rPr>
+                <w:b w:val="false"/>
+                <w:bCs w:val="false"/>
+                <w:sz w:val="19"/>
+                <w:szCs w:val="19"/>
+              </w:rPr>
+              <w:t xml:space="preserve">10</w:t>
+            </w:r>
+          </w:p>
+        </w:tc>
+        <w:tc>
+          <w:tcPr>
+            <w:tcW w:type="dxa" w:w="2706"/>
+            <w:tcMar>
+              <w:top w:type="dxa" w:w="50"/>
+              <w:left w:type="dxa" w:w="100"/>
+              <w:bottom w:type="dxa" w:w="50"/>
+              <w:right w:type="dxa" w:w="100"/>
+            </w:tcMar>
+            <w:vAlign w:val="center"/>
+          </w:tcPr>
+          <w:p>
+            <w:pPr>
+              <w:spacing w:after="0"/>
+            </w:pPr>
+            <w:r>
+              <w:rPr>
+                <w:b w:val="false"/>
+                <w:bCs w:val="false"/>
+                <w:sz w:val="19"/>
+                <w:szCs w:val="19"/>
+              </w:rPr>
+              <w:t xml:space="preserve">2,000</w:t>
+            </w:r>
+          </w:p>
+        </w:tc>
+      </w:tr>
+      <w:tr>
+        <w:tc>
+          <w:tcPr>
+            <w:tcW w:type="dxa" w:w="1200"/>
+            <w:tcMar>
+              <w:top w:type="dxa" w:w="50"/>
+              <w:left w:type="dxa" w:w="100"/>
+              <w:bottom w:type="dxa" w:w="50"/>
+              <w:right w:type="dxa" w:w="100"/>
+            </w:tcMar>
+            <w:vAlign w:val="center"/>
+          </w:tcPr>
+          <w:p>
+            <w:pPr>
+              <w:spacing w:after="0"/>
+            </w:pPr>
+            <w:r>
+              <w:rPr>
+                <w:b w:val="false"/>
+                <w:bCs w:val="false"/>
+                <w:sz w:val="19"/>
+                <w:szCs w:val="19"/>
+              </w:rPr>
+              <w:t xml:space="preserve">B-2</w:t>
+            </w:r>
+          </w:p>
+        </w:tc>
+        <w:tc>
+          <w:tcPr>
+            <w:tcW w:type="dxa" w:w="2700"/>
+            <w:tcMar>
+              <w:top w:type="dxa" w:w="50"/>
+              <w:left w:type="dxa" w:w="100"/>
+              <w:bottom w:type="dxa" w:w="50"/>
+              <w:right w:type="dxa" w:w="100"/>
+            </w:tcMar>
+            <w:vAlign w:val="center"/>
+          </w:tcPr>
+          <w:p>
+            <w:pPr>
+              <w:spacing w:after="0"/>
+            </w:pPr>
+            <w:r>
+              <w:rPr>
+                <w:b w:val="false"/>
+                <w:bCs w:val="false"/>
+                <w:sz w:val="19"/>
+                <w:szCs w:val="19"/>
+              </w:rPr>
+              <w:t xml:space="preserve">135</w:t>
+            </w:r>
+          </w:p>
+        </w:tc>
+        <w:tc>
+          <w:tcPr>
+            <w:tcW w:type="dxa" w:w="2700"/>
+            <w:tcMar>
+              <w:top w:type="dxa" w:w="50"/>
+              <w:left w:type="dxa" w:w="100"/>
+              <w:bottom w:type="dxa" w:w="50"/>
+              <w:right w:type="dxa" w:w="100"/>
+            </w:tcMar>
+            <w:vAlign w:val="center"/>
+          </w:tcPr>
+          <w:p>
+            <w:pPr>
+              <w:spacing w:after="0"/>
+            </w:pPr>
+            <w:r>
+              <w:rPr>
+                <w:b w:val="false"/>
+                <w:bCs w:val="false"/>
+                <w:sz w:val="19"/>
+                <w:szCs w:val="19"/>
+              </w:rPr>
+              <w:t xml:space="preserve">10</w:t>
+            </w:r>
+          </w:p>
+        </w:tc>
+        <w:tc>
+          <w:tcPr>
+            <w:tcW w:type="dxa" w:w="2706"/>
+            <w:tcMar>
+              <w:top w:type="dxa" w:w="50"/>
+              <w:left w:type="dxa" w:w="100"/>
+              <w:bottom w:type="dxa" w:w="50"/>
+              <w:right w:type="dxa" w:w="100"/>
+            </w:tcMar>
+            <w:vAlign w:val="center"/>
+          </w:tcPr>
+          <w:p>
+            <w:pPr>
+              <w:spacing w:after="0"/>
+            </w:pPr>
+            <w:r>
+              <w:rPr>
+                <w:b w:val="false"/>
+                <w:bCs w:val="false"/>
+                <w:sz w:val="19"/>
+                <w:szCs w:val="19"/>
+              </w:rPr>
+              <w:t xml:space="preserve">2,000</w:t>
+            </w:r>
+          </w:p>
+        </w:tc>
+      </w:tr>
+      <w:tr>
+        <w:tc>
+          <w:tcPr>
+            <w:tcW w:type="dxa" w:w="1200"/>
+            <w:tcMar>
+              <w:top w:type="dxa" w:w="50"/>
+              <w:left w:type="dxa" w:w="100"/>
+              <w:bottom w:type="dxa" w:w="50"/>
+              <w:right w:type="dxa" w:w="100"/>
+            </w:tcMar>
+            <w:vAlign w:val="center"/>
+          </w:tcPr>
+          <w:p>
+            <w:pPr>
+              <w:spacing w:after="0"/>
+            </w:pPr>
+            <w:r>
+              <w:rPr>
+                <w:b w:val="false"/>
+                <w:bCs w:val="false"/>
+                <w:sz w:val="19"/>
+                <w:szCs w:val="19"/>
+              </w:rPr>
+              <w:t xml:space="preserve">B-3</w:t>
+            </w:r>
+          </w:p>
+        </w:tc>
+        <w:tc>
+          <w:tcPr>
+            <w:tcW w:type="dxa" w:w="2700"/>
+            <w:tcMar>
+              <w:top w:type="dxa" w:w="50"/>
+              <w:left w:type="dxa" w:w="100"/>
+              <w:bottom w:type="dxa" w:w="50"/>
+              <w:right w:type="dxa" w:w="100"/>
+            </w:tcMar>
+            <w:vAlign w:val="center"/>
+          </w:tcPr>
+          <w:p>
+            <w:pPr>
+              <w:spacing w:after="0"/>
+            </w:pPr>
+            <w:r>
+              <w:rPr>
+                <w:b w:val="false"/>
+                <w:bCs w:val="false"/>
+                <w:sz w:val="19"/>
+                <w:szCs w:val="19"/>
+              </w:rPr>
+              <w:t xml:space="preserve">155</w:t>
+            </w:r>
+          </w:p>
+        </w:tc>
+        <w:tc>
+          <w:tcPr>
+            <w:tcW w:type="dxa" w:w="2700"/>
+            <w:tcMar>
+              <w:top w:type="dxa" w:w="50"/>
+              <w:left w:type="dxa" w:w="100"/>
+              <w:bottom w:type="dxa" w:w="50"/>
+              <w:right w:type="dxa" w:w="100"/>
+            </w:tcMar>
+            <w:vAlign w:val="center"/>
+          </w:tcPr>
+          <w:p>
+            <w:pPr>
+              <w:spacing w:after="0"/>
+            </w:pPr>
+            <w:r>
+              <w:rPr>
+                <w:b w:val="false"/>
+                <w:bCs w:val="false"/>
+                <w:sz w:val="19"/>
+                <w:szCs w:val="19"/>
+              </w:rPr>
+              <w:t xml:space="preserve">10</w:t>
+            </w:r>
+          </w:p>
+        </w:tc>
+        <w:tc>
+          <w:tcPr>
+            <w:tcW w:type="dxa" w:w="2706"/>
+            <w:tcMar>
+              <w:top w:type="dxa" w:w="50"/>
+              <w:left w:type="dxa" w:w="100"/>
+              <w:bottom w:type="dxa" w:w="50"/>
+              <w:right w:type="dxa" w:w="100"/>
+            </w:tcMar>
+            <w:vAlign w:val="center"/>
+          </w:tcPr>
+          <w:p>
+            <w:pPr>
+              <w:spacing w:after="0"/>
+            </w:pPr>
+            <w:r>
+              <w:rPr>
+                <w:b w:val="false"/>
+                <w:bCs w:val="false"/>
+                <w:sz w:val="19"/>
+                <w:szCs w:val="19"/>
+              </w:rPr>
+              <w:t xml:space="preserve">2,000</w:t>
+            </w:r>
+          </w:p>
+        </w:tc>
+      </w:tr>
+      <w:tr>
+        <w:tc>
+          <w:tcPr>
+            <w:tcW w:type="dxa" w:w="1200"/>
+            <w:tcMar>
+              <w:top w:type="dxa" w:w="50"/>
+              <w:left w:type="dxa" w:w="100"/>
+              <w:bottom w:type="dxa" w:w="50"/>
+              <w:right w:type="dxa" w:w="100"/>
+            </w:tcMar>
+            <w:vAlign w:val="center"/>
+          </w:tcPr>
+          <w:p>
+            <w:pPr>
+              <w:spacing w:after="0"/>
+            </w:pPr>
+            <w:r>
+              <w:rPr>
+                <w:b w:val="false"/>
+                <w:bCs w:val="false"/>
+                <w:sz w:val="19"/>
+                <w:szCs w:val="19"/>
+              </w:rPr>
+              <w:t xml:space="preserve">B-4</w:t>
+            </w:r>
+          </w:p>
+        </w:tc>
+        <w:tc>
+          <w:tcPr>
+            <w:tcW w:type="dxa" w:w="2700"/>
+            <w:tcMar>
+              <w:top w:type="dxa" w:w="50"/>
+              <w:left w:type="dxa" w:w="100"/>
+              <w:bottom w:type="dxa" w:w="50"/>
+              <w:right w:type="dxa" w:w="100"/>
+            </w:tcMar>
+            <w:vAlign w:val="center"/>
+          </w:tcPr>
+          <w:p>
+            <w:pPr>
+              <w:spacing w:after="0"/>
+            </w:pPr>
+            <w:r>
+              <w:rPr>
+                <w:b w:val="false"/>
+                <w:bCs w:val="false"/>
+                <w:sz w:val="19"/>
+                <w:szCs w:val="19"/>
+              </w:rPr>
+              <w:t xml:space="preserve">165</w:t>
+            </w:r>
+          </w:p>
+        </w:tc>
+        <w:tc>
+          <w:tcPr>
+            <w:tcW w:type="dxa" w:w="2700"/>
+            <w:tcMar>
+              <w:top w:type="dxa" w:w="50"/>
+              <w:left w:type="dxa" w:w="100"/>
+              <w:bottom w:type="dxa" w:w="50"/>
+              <w:right w:type="dxa" w:w="100"/>
+            </w:tcMar>
+            <w:vAlign w:val="center"/>
+          </w:tcPr>
+          <w:p>
+            <w:pPr>
+              <w:spacing w:after="0"/>
+            </w:pPr>
+            <w:r>
+              <w:rPr>
+                <w:b w:val="false"/>
+                <w:bCs w:val="false"/>
+                <w:sz w:val="19"/>
+                <w:szCs w:val="19"/>
+              </w:rPr>
+              <w:t xml:space="preserve">10</w:t>
+            </w:r>
+          </w:p>
+        </w:tc>
+        <w:tc>
+          <w:tcPr>
+            <w:tcW w:type="dxa" w:w="2706"/>
+            <w:tcMar>
+              <w:top w:type="dxa" w:w="50"/>
+              <w:left w:type="dxa" w:w="100"/>
+              <w:bottom w:type="dxa" w:w="50"/>
+              <w:right w:type="dxa" w:w="100"/>
+            </w:tcMar>
+            <w:vAlign w:val="center"/>
+          </w:tcPr>
+          <w:p>
+            <w:pPr>
+              <w:spacing w:after="0"/>
+            </w:pPr>
+            <w:r>
+              <w:rPr>
+                <w:b w:val="false"/>
+                <w:bCs w:val="false"/>
+                <w:sz w:val="19"/>
+                <w:szCs w:val="19"/>
+              </w:rPr>
+              <w:t xml:space="preserve">2,000</w:t>
+            </w:r>
+          </w:p>
+        </w:tc>
+      </w:tr>
+      <w:tr>
+        <w:tc>
+          <w:tcPr>
+            <w:tcW w:type="dxa" w:w="1200"/>
+            <w:tcMar>
+              <w:top w:type="dxa" w:w="50"/>
+              <w:left w:type="dxa" w:w="100"/>
+              <w:bottom w:type="dxa" w:w="50"/>
+              <w:right w:type="dxa" w:w="100"/>
+            </w:tcMar>
+            <w:vAlign w:val="center"/>
+          </w:tcPr>
+          <w:p>
+            <w:pPr>
+              <w:spacing w:after="0"/>
+            </w:pPr>
+            <w:r>
+              <w:rPr>
+                <w:b w:val="false"/>
+                <w:bCs w:val="false"/>
+                <w:sz w:val="19"/>
+                <w:szCs w:val="19"/>
+              </w:rPr>
+              <w:t xml:space="preserve">B-5</w:t>
+            </w:r>
+          </w:p>
+        </w:tc>
+        <w:tc>
+          <w:tcPr>
+            <w:tcW w:type="dxa" w:w="2700"/>
+            <w:tcMar>
+              <w:top w:type="dxa" w:w="50"/>
+              <w:left w:type="dxa" w:w="100"/>
+              <w:bottom w:type="dxa" w:w="50"/>
+              <w:right w:type="dxa" w:w="100"/>
+            </w:tcMar>
+            <w:vAlign w:val="center"/>
+          </w:tcPr>
+          <w:p>
+            <w:pPr>
+              <w:spacing w:after="0"/>
+            </w:pPr>
+            <w:r>
+              <w:rPr>
+                <w:b w:val="false"/>
+                <w:bCs w:val="false"/>
+                <w:sz w:val="19"/>
+                <w:szCs w:val="19"/>
+              </w:rPr>
+              <w:t xml:space="preserve">175</w:t>
+            </w:r>
+          </w:p>
+        </w:tc>
+        <w:tc>
+          <w:tcPr>
+            <w:tcW w:type="dxa" w:w="2700"/>
+            <w:tcMar>
+              <w:top w:type="dxa" w:w="50"/>
+              <w:left w:type="dxa" w:w="100"/>
+              <w:bottom w:type="dxa" w:w="50"/>
+              <w:right w:type="dxa" w:w="100"/>
+            </w:tcMar>
+            <w:vAlign w:val="center"/>
+          </w:tcPr>
+          <w:p>
+            <w:pPr>
+              <w:spacing w:after="0"/>
+            </w:pPr>
+            <w:r>
+              <w:rPr>
+                <w:b w:val="false"/>
+                <w:bCs w:val="false"/>
+                <w:sz w:val="19"/>
+                <w:szCs w:val="19"/>
+              </w:rPr>
+              <w:t xml:space="preserve">10</w:t>
+            </w:r>
+          </w:p>
+        </w:tc>
+        <w:tc>
+          <w:tcPr>
+            <w:tcW w:type="dxa" w:w="2706"/>
+            <w:tcMar>
+              <w:top w:type="dxa" w:w="50"/>
+              <w:left w:type="dxa" w:w="100"/>
+              <w:bottom w:type="dxa" w:w="50"/>
+              <w:right w:type="dxa" w:w="100"/>
+            </w:tcMar>
+            <w:vAlign w:val="center"/>
+          </w:tcPr>
+          <w:p>
+            <w:pPr>
+              <w:spacing w:after="0"/>
+            </w:pPr>
+            <w:r>
+              <w:rPr>
+                <w:b w:val="false"/>
+                <w:bCs w:val="false"/>
+                <w:sz w:val="19"/>
+                <w:szCs w:val="19"/>
+              </w:rPr>
+              <w:t xml:space="preserve">2,000</w:t>
+            </w:r>
+          </w:p>
+        </w:tc>
+      </w:tr>
+      <w:tr>
+        <w:tc>
+          <w:tcPr>
+            <w:tcW w:type="dxa" w:w="1200"/>
+            <w:tcMar>
+              <w:top w:type="dxa" w:w="50"/>
+              <w:left w:type="dxa" w:w="100"/>
+              <w:bottom w:type="dxa" w:w="50"/>
+              <w:right w:type="dxa" w:w="100"/>
+            </w:tcMar>
+            <w:vAlign w:val="center"/>
+          </w:tcPr>
+          <w:p>
+            <w:pPr>
+              <w:spacing w:after="0"/>
+            </w:pPr>
+            <w:r>
+              <w:rPr>
+                <w:b w:val="false"/>
+                <w:bCs w:val="false"/>
+                <w:sz w:val="19"/>
+                <w:szCs w:val="19"/>
+              </w:rPr>
+              <w:t xml:space="preserve">B-6</w:t>
+            </w:r>
+          </w:p>
+        </w:tc>
+        <w:tc>
+          <w:tcPr>
+            <w:tcW w:type="dxa" w:w="2700"/>
+            <w:tcMar>
+              <w:top w:type="dxa" w:w="50"/>
+              <w:left w:type="dxa" w:w="100"/>
+              <w:bottom w:type="dxa" w:w="50"/>
+              <w:right w:type="dxa" w:w="100"/>
+            </w:tcMar>
+            <w:vAlign w:val="center"/>
+          </w:tcPr>
+          <w:p>
+            <w:pPr>
+              <w:spacing w:after="0"/>
+            </w:pPr>
+            <w:r>
+              <w:rPr>
+                <w:b w:val="false"/>
+                <w:bCs w:val="false"/>
+                <w:sz w:val="19"/>
+                <w:szCs w:val="19"/>
+              </w:rPr>
+              <w:t xml:space="preserve">185</w:t>
+            </w:r>
+          </w:p>
+        </w:tc>
+        <w:tc>
+          <w:tcPr>
+            <w:tcW w:type="dxa" w:w="2700"/>
+            <w:tcMar>
+              <w:top w:type="dxa" w:w="50"/>
+              <w:left w:type="dxa" w:w="100"/>
+              <w:bottom w:type="dxa" w:w="50"/>
+              <w:right w:type="dxa" w:w="100"/>
+            </w:tcMar>
+            <w:vAlign w:val="center"/>
+          </w:tcPr>
+          <w:p>
+            <w:pPr>
+              <w:spacing w:after="0"/>
+            </w:pPr>
+            <w:r>
+              <w:rPr>
+                <w:b w:val="false"/>
+                <w:bCs w:val="false"/>
+                <w:sz w:val="19"/>
+                <w:szCs w:val="19"/>
+              </w:rPr>
+              <w:t xml:space="preserve">10</w:t>
+            </w:r>
+          </w:p>
+        </w:tc>
+        <w:tc>
+          <w:tcPr>
+            <w:tcW w:type="dxa" w:w="2706"/>
+            <w:tcMar>
+              <w:top w:type="dxa" w:w="50"/>
+              <w:left w:type="dxa" w:w="100"/>
+              <w:bottom w:type="dxa" w:w="50"/>
+              <w:right w:type="dxa" w:w="100"/>
+            </w:tcMar>
+            <w:vAlign w:val="center"/>
+          </w:tcPr>
+          <w:p>
+            <w:pPr>
+              <w:spacing w:after="0"/>
+            </w:pPr>
+            <w:r>
+              <w:rPr>
+                <w:b w:val="false"/>
+                <w:bCs w:val="false"/>
+                <w:sz w:val="19"/>
+                <w:szCs w:val="19"/>
+              </w:rPr>
+              <w:t xml:space="preserve">2,000</w:t>
+            </w:r>
+          </w:p>
+        </w:tc>
+      </w:tr>
+      <w:tr>
+        <w:tc>
+          <w:tcPr>
+            <w:tcW w:type="dxa" w:w="1200"/>
+            <w:tcMar>
+              <w:top w:type="dxa" w:w="50"/>
+              <w:left w:type="dxa" w:w="100"/>
+              <w:bottom w:type="dxa" w:w="50"/>
+              <w:right w:type="dxa" w:w="100"/>
+            </w:tcMar>
+            <w:vAlign w:val="center"/>
+          </w:tcPr>
+          <w:p>
+            <w:pPr>
+              <w:spacing w:after="0"/>
+            </w:pPr>
+            <w:r>
+              <w:rPr>
+                <w:b w:val="false"/>
+                <w:bCs w:val="false"/>
+                <w:sz w:val="19"/>
+                <w:szCs w:val="19"/>
+              </w:rPr>
+              <w:t xml:space="preserve">B-7</w:t>
+            </w:r>
+          </w:p>
+        </w:tc>
+        <w:tc>
+          <w:tcPr>
+            <w:tcW w:type="dxa" w:w="2700"/>
+            <w:tcMar>
+              <w:top w:type="dxa" w:w="50"/>
+              <w:left w:type="dxa" w:w="100"/>
+              <w:bottom w:type="dxa" w:w="50"/>
+              <w:right w:type="dxa" w:w="100"/>
+            </w:tcMar>
+            <w:vAlign w:val="center"/>
+          </w:tcPr>
+          <w:p>
+            <w:pPr>
+              <w:spacing w:after="0"/>
+            </w:pPr>
+            <w:r>
+              <w:rPr>
+                <w:b w:val="false"/>
+                <w:bCs w:val="false"/>
+                <w:sz w:val="19"/>
+                <w:szCs w:val="19"/>
+              </w:rPr>
+              <w:t xml:space="preserve">195</w:t>
+            </w:r>
+          </w:p>
+        </w:tc>
+        <w:tc>
+          <w:tcPr>
+            <w:tcW w:type="dxa" w:w="2700"/>
+            <w:tcMar>
+              <w:top w:type="dxa" w:w="50"/>
+              <w:left w:type="dxa" w:w="100"/>
+              <w:bottom w:type="dxa" w:w="50"/>
+              <w:right w:type="dxa" w:w="100"/>
+            </w:tcMar>
+            <w:vAlign w:val="center"/>
+          </w:tcPr>
+          <w:p>
+            <w:pPr>
+              <w:spacing w:after="0"/>
+            </w:pPr>
+            <w:r>
+              <w:rPr>
+                <w:b w:val="false"/>
+                <w:bCs w:val="false"/>
+                <w:sz w:val="19"/>
+                <w:szCs w:val="19"/>
+              </w:rPr>
+              <w:t xml:space="preserve">10</w:t>
+            </w:r>
+          </w:p>
+        </w:tc>
+        <w:tc>
+          <w:tcPr>
+            <w:tcW w:type="dxa" w:w="2706"/>
+            <w:tcMar>
+              <w:top w:type="dxa" w:w="50"/>
+              <w:left w:type="dxa" w:w="100"/>
+              <w:bottom w:type="dxa" w:w="50"/>
+              <w:right w:type="dxa" w:w="100"/>
+            </w:tcMar>
+            <w:vAlign w:val="center"/>
+          </w:tcPr>
+          <w:p>
+            <w:pPr>
+              <w:spacing w:after="0"/>
+            </w:pPr>
+            <w:r>
+              <w:rPr>
+                <w:b w:val="false"/>
+                <w:bCs w:val="false"/>
+                <w:sz w:val="19"/>
+                <w:szCs w:val="19"/>
+              </w:rPr>
+              <w:t xml:space="preserve">2,000</w:t>
+            </w:r>
+          </w:p>
+        </w:tc>
+      </w:tr>
+      <w:tr>
+        <w:tc>
+          <w:tcPr>
+            <w:tcW w:type="dxa" w:w="1200"/>
+            <w:tcMar>
+              <w:top w:type="dxa" w:w="50"/>
+              <w:left w:type="dxa" w:w="100"/>
+              <w:bottom w:type="dxa" w:w="50"/>
+              <w:right w:type="dxa" w:w="100"/>
+            </w:tcMar>
+            <w:vAlign w:val="center"/>
+          </w:tcPr>
+          <w:p>
+            <w:pPr>
+              <w:spacing w:after="0"/>
+            </w:pPr>
+            <w:r>
+              <w:rPr>
+                <w:b w:val="false"/>
+                <w:bCs w:val="false"/>
+                <w:sz w:val="19"/>
+                <w:szCs w:val="19"/>
+              </w:rPr>
+              <w:t xml:space="preserve">B-8</w:t>
+            </w:r>
+          </w:p>
+        </w:tc>
+        <w:tc>
+          <w:tcPr>
+            <w:tcW w:type="dxa" w:w="2700"/>
+            <w:tcMar>
+              <w:top w:type="dxa" w:w="50"/>
+              <w:left w:type="dxa" w:w="100"/>
+              <w:bottom w:type="dxa" w:w="50"/>
+              <w:right w:type="dxa" w:w="100"/>
+            </w:tcMar>
+            <w:vAlign w:val="center"/>
+          </w:tcPr>
+          <w:p>
+            <w:pPr>
+              <w:spacing w:after="0"/>
+            </w:pPr>
+            <w:r>
+              <w:rPr>
+                <w:b w:val="false"/>
+                <w:bCs w:val="false"/>
+                <w:sz w:val="19"/>
+                <w:szCs w:val="19"/>
+              </w:rPr>
+              <w:t xml:space="preserve">220</w:t>
+            </w:r>
+          </w:p>
+        </w:tc>
+        <w:tc>
+          <w:tcPr>
+            <w:tcW w:type="dxa" w:w="2700"/>
+            <w:tcMar>
+              <w:top w:type="dxa" w:w="50"/>
+              <w:left w:type="dxa" w:w="100"/>
+              <w:bottom w:type="dxa" w:w="50"/>
+              <w:right w:type="dxa" w:w="100"/>
+            </w:tcMar>
+            <w:vAlign w:val="center"/>
+          </w:tcPr>
+          <w:p>
+            <w:pPr>
+              <w:spacing w:after="0"/>
+            </w:pPr>
+            <w:r>
+              <w:rPr>
+                <w:b w:val="false"/>
+                <w:bCs w:val="false"/>
+                <w:sz w:val="19"/>
+                <w:szCs w:val="19"/>
+              </w:rPr>
+              <w:t xml:space="preserve">10</w:t>
+            </w:r>
+          </w:p>
+        </w:tc>
+        <w:tc>
+          <w:tcPr>
+            <w:tcW w:type="dxa" w:w="2706"/>
+            <w:tcMar>
+              <w:top w:type="dxa" w:w="50"/>
+              <w:left w:type="dxa" w:w="100"/>
+              <w:bottom w:type="dxa" w:w="50"/>
+              <w:right w:type="dxa" w:w="100"/>
+            </w:tcMar>
+            <w:vAlign w:val="center"/>
+          </w:tcPr>
+          <w:p>
+            <w:pPr>
+              <w:spacing w:after="0"/>
+            </w:pPr>
+            <w:r>
+              <w:rPr>
+                <w:b w:val="false"/>
+                <w:bCs w:val="false"/>
+                <w:sz w:val="19"/>
+                <w:szCs w:val="19"/>
+              </w:rPr>
+              <w:t xml:space="preserve">2,000</w:t>
+            </w:r>
+          </w:p>
+        </w:tc>
+      </w:tr>
+      <w:tr>
+        <w:tc>
+          <w:tcPr>
+            <w:tcW w:type="dxa" w:w="1200"/>
+            <w:tcMar>
+              <w:top w:type="dxa" w:w="50"/>
+              <w:left w:type="dxa" w:w="100"/>
+              <w:bottom w:type="dxa" w:w="50"/>
+              <w:right w:type="dxa" w:w="100"/>
+            </w:tcMar>
+            <w:vAlign w:val="center"/>
+          </w:tcPr>
+          <w:p>
+            <w:pPr>
+              <w:spacing w:after="0"/>
+            </w:pPr>
+            <w:r>
+              <w:rPr>
+                <w:b w:val="false"/>
+                <w:bCs w:val="false"/>
+                <w:sz w:val="19"/>
+                <w:szCs w:val="19"/>
+              </w:rPr>
+              <w:t xml:space="preserve">B-9</w:t>
+            </w:r>
+          </w:p>
+        </w:tc>
+        <w:tc>
+          <w:tcPr>
+            <w:tcW w:type="dxa" w:w="2700"/>
+            <w:tcMar>
+              <w:top w:type="dxa" w:w="50"/>
+              <w:left w:type="dxa" w:w="100"/>
+              <w:bottom w:type="dxa" w:w="50"/>
+              <w:right w:type="dxa" w:w="100"/>
+            </w:tcMar>
+            <w:vAlign w:val="center"/>
+          </w:tcPr>
+          <w:p>
+            <w:pPr>
+              <w:spacing w:after="0"/>
+            </w:pPr>
+            <w:r>
+              <w:rPr>
+                <w:b w:val="false"/>
+                <w:bCs w:val="false"/>
+                <w:sz w:val="19"/>
+                <w:szCs w:val="19"/>
+              </w:rPr>
+              <w:t xml:space="preserve">260</w:t>
+            </w:r>
+          </w:p>
+        </w:tc>
+        <w:tc>
+          <w:tcPr>
+            <w:tcW w:type="dxa" w:w="2700"/>
+            <w:tcMar>
+              <w:top w:type="dxa" w:w="50"/>
+              <w:left w:type="dxa" w:w="100"/>
+              <w:bottom w:type="dxa" w:w="50"/>
+              <w:right w:type="dxa" w:w="100"/>
+            </w:tcMar>
+            <w:vAlign w:val="center"/>
+          </w:tcPr>
+          <w:p>
+            <w:pPr>
+              <w:spacing w:after="0"/>
+            </w:pPr>
+            <w:r>
+              <w:rPr>
+                <w:b w:val="false"/>
+                <w:bCs w:val="false"/>
+                <w:sz w:val="19"/>
+                <w:szCs w:val="19"/>
+              </w:rPr>
+              <w:t xml:space="preserve">10</w:t>
+            </w:r>
+          </w:p>
+        </w:tc>
+        <w:tc>
+          <w:tcPr>
+            <w:tcW w:type="dxa" w:w="2706"/>
+            <w:tcMar>
+              <w:top w:type="dxa" w:w="50"/>
+              <w:left w:type="dxa" w:w="100"/>
+              <w:bottom w:type="dxa" w:w="50"/>
+              <w:right w:type="dxa" w:w="100"/>
+            </w:tcMar>
+            <w:vAlign w:val="center"/>
+          </w:tcPr>
+          <w:p>
+            <w:pPr>
+              <w:spacing w:after="0"/>
+            </w:pPr>
+            <w:r>
+              <w:rPr>
+                <w:b w:val="false"/>
+                <w:bCs w:val="false"/>
+                <w:sz w:val="19"/>
+                <w:szCs w:val="19"/>
+              </w:rPr>
+              <w:t xml:space="preserve">2,000</w:t>
+            </w:r>
+          </w:p>
+        </w:tc>
+      </w:tr>
+      <w:tr>
+        <w:tc>
+          <w:tcPr>
+            <w:tcW w:type="dxa" w:w="1200"/>
+            <w:tcMar>
+              <w:top w:type="dxa" w:w="50"/>
+              <w:left w:type="dxa" w:w="100"/>
+              <w:bottom w:type="dxa" w:w="50"/>
+              <w:right w:type="dxa" w:w="100"/>
+            </w:tcMar>
+            <w:vAlign w:val="center"/>
+          </w:tcPr>
+          <w:p>
+            <w:pPr>
+              <w:spacing w:after="0"/>
+            </w:pPr>
+            <w:r>
+              <w:rPr>
+                <w:b w:val="false"/>
+                <w:bCs w:val="false"/>
+                <w:sz w:val="19"/>
+                <w:szCs w:val="19"/>
+              </w:rPr>
+              <w:t xml:space="preserve">B-10</w:t>
+            </w:r>
+          </w:p>
+        </w:tc>
+        <w:tc>
+          <w:tcPr>
+            <w:tcW w:type="dxa" w:w="2700"/>
+            <w:tcMar>
+              <w:top w:type="dxa" w:w="50"/>
+              <w:left w:type="dxa" w:w="100"/>
+              <w:bottom w:type="dxa" w:w="50"/>
+              <w:right w:type="dxa" w:w="100"/>
+            </w:tcMar>
+            <w:vAlign w:val="center"/>
+          </w:tcPr>
+          <w:p>
+            <w:pPr>
+              <w:spacing w:after="0"/>
+            </w:pPr>
+            <w:r>
+              <w:rPr>
+                <w:b w:val="false"/>
+                <w:bCs w:val="false"/>
+                <w:sz w:val="19"/>
+                <w:szCs w:val="19"/>
+              </w:rPr>
+              <w:t xml:space="preserve">270</w:t>
+            </w:r>
+          </w:p>
+        </w:tc>
+        <w:tc>
+          <w:tcPr>
+            <w:tcW w:type="dxa" w:w="2700"/>
+            <w:tcMar>
+              <w:top w:type="dxa" w:w="50"/>
+              <w:left w:type="dxa" w:w="100"/>
+              <w:bottom w:type="dxa" w:w="50"/>
+              <w:right w:type="dxa" w:w="100"/>
+            </w:tcMar>
+            <w:vAlign w:val="center"/>
+          </w:tcPr>
+          <w:p>
+            <w:pPr>
+              <w:spacing w:after="0"/>
+            </w:pPr>
+            <w:r>
+              <w:rPr>
+                <w:b w:val="false"/>
+                <w:bCs w:val="false"/>
+                <w:sz w:val="19"/>
+                <w:szCs w:val="19"/>
+              </w:rPr>
+              <w:t xml:space="preserve">10</w:t>
+            </w:r>
+          </w:p>
+        </w:tc>
+        <w:tc>
+          <w:tcPr>
+            <w:tcW w:type="dxa" w:w="2706"/>
+            <w:tcMar>
+              <w:top w:type="dxa" w:w="50"/>
+              <w:left w:type="dxa" w:w="100"/>
+              <w:bottom w:type="dxa" w:w="50"/>
+              <w:right w:type="dxa" w:w="100"/>
+            </w:tcMar>
+            <w:vAlign w:val="center"/>
+          </w:tcPr>
+          <w:p>
+            <w:pPr>
+              <w:spacing w:after="0"/>
+            </w:pPr>
+            <w:r>
+              <w:rPr>
+                <w:b w:val="false"/>
+                <w:bCs w:val="false"/>
+                <w:sz w:val="19"/>
+                <w:szCs w:val="19"/>
+              </w:rPr>
+              <w:t xml:space="preserve">2,000</w:t>
+            </w:r>
+          </w:p>
+        </w:tc>
+      </w:tr>
+      <w:tr>
+        <w:tc>
+          <w:tcPr>
+            <w:tcW w:type="dxa" w:w="1200"/>
+            <w:tcMar>
+              <w:top w:type="dxa" w:w="50"/>
+              <w:left w:type="dxa" w:w="100"/>
+              <w:bottom w:type="dxa" w:w="50"/>
+              <w:right w:type="dxa" w:w="100"/>
+            </w:tcMar>
+            <w:vAlign w:val="center"/>
+          </w:tcPr>
+          <w:p>
+            <w:pPr>
+              <w:spacing w:after="0"/>
+            </w:pPr>
+            <w:r>
+              <w:rPr>
+                <w:b w:val="false"/>
+                <w:bCs w:val="false"/>
+                <w:sz w:val="19"/>
+                <w:szCs w:val="19"/>
+              </w:rPr>
+              <w:t xml:space="preserve">B-11</w:t>
+            </w:r>
+          </w:p>
+        </w:tc>
+        <w:tc>
+          <w:tcPr>
+            <w:tcW w:type="dxa" w:w="2700"/>
+            <w:tcMar>
+              <w:top w:type="dxa" w:w="50"/>
+              <w:left w:type="dxa" w:w="100"/>
+              <w:bottom w:type="dxa" w:w="50"/>
+              <w:right w:type="dxa" w:w="100"/>
+            </w:tcMar>
+            <w:vAlign w:val="center"/>
+          </w:tcPr>
+          <w:p>
+            <w:pPr>
+              <w:spacing w:after="0"/>
+            </w:pPr>
+            <w:r>
+              <w:rPr>
+                <w:b w:val="false"/>
+                <w:bCs w:val="false"/>
+                <w:sz w:val="19"/>
+                <w:szCs w:val="19"/>
+              </w:rPr>
+              <w:t xml:space="preserve">280</w:t>
+            </w:r>
+          </w:p>
+        </w:tc>
+        <w:tc>
+          <w:tcPr>
+            <w:tcW w:type="dxa" w:w="2700"/>
+            <w:tcMar>
+              <w:top w:type="dxa" w:w="50"/>
+              <w:left w:type="dxa" w:w="100"/>
+              <w:bottom w:type="dxa" w:w="50"/>
+              <w:right w:type="dxa" w:w="100"/>
+            </w:tcMar>
+            <w:vAlign w:val="center"/>
+          </w:tcPr>
+          <w:p>
+            <w:pPr>
+              <w:spacing w:after="0"/>
+            </w:pPr>
+            <w:r>
+              <w:rPr>
+                <w:b w:val="false"/>
+                <w:bCs w:val="false"/>
+                <w:sz w:val="19"/>
+                <w:szCs w:val="19"/>
+              </w:rPr>
+              <w:t xml:space="preserve">10</w:t>
+            </w:r>
+          </w:p>
+        </w:tc>
+        <w:tc>
+          <w:tcPr>
+            <w:tcW w:type="dxa" w:w="2706"/>
+            <w:tcMar>
+              <w:top w:type="dxa" w:w="50"/>
+              <w:left w:type="dxa" w:w="100"/>
+              <w:bottom w:type="dxa" w:w="50"/>
+              <w:right w:type="dxa" w:w="100"/>
+            </w:tcMar>
+            <w:vAlign w:val="center"/>
+          </w:tcPr>
+          <w:p>
+            <w:pPr>
+              <w:spacing w:after="0"/>
+            </w:pPr>
+            <w:r>
+              <w:rPr>
+                <w:b w:val="false"/>
+                <w:bCs w:val="false"/>
+                <w:sz w:val="19"/>
+                <w:szCs w:val="19"/>
+              </w:rPr>
+              <w:t xml:space="preserve">2,000</w:t>
+            </w:r>
+          </w:p>
+        </w:tc>
+      </w:tr>
+    </w:tbl>
+    <w:p>
+      <w:pPr>
+        <w:spacing w:after="40" w:before="120"/>
+      </w:pPr>
+      <w:r>
+        <w:rPr>
+          <w:b/>
+          <w:bCs/>
+          <w:sz w:val="21"/>
+          <w:szCs w:val="21"/>
+        </w:rPr>
+        <w:t xml:space="preserve">Please provide: unit price (FOB Qingdao and CIF Incheon), MOQ per size, and lead time.</w:t>
+      </w:r>
+    </w:p>
+    <w:p>
+      <w:pPr>
+        <w:spacing w:after="40"/>
+      </w:pPr>
+      <w:r>
+        <w:rPr>
+          <w:color w:val="555555"/>
+          <w:sz w:val="20"/>
+          <w:szCs w:val="20"/>
+        </w:rPr>
+        <w:t xml:space="preserve">품목별 단가(FOB Qingdao / CIF Incheon), MOQ, 납기 회신 요청.</w:t>
       </w:r>
     </w:p>
     <w:sectPr>

</xml_diff>